<commit_message>
feat: correção de erros no checkList e Bem Vindo
</commit_message>
<xml_diff>
--- a/templates/welcome-model.docx
+++ b/templates/welcome-model.docx
@@ -261,26 +261,7 @@
             <w14:round/>
           </w14:textOutline>
         </w:rPr>
-        <w:t xml:space="preserve"> Senha: </w:t>
-      </w:r>
-      <w:r>
-        <w:rPr>
-          <w:rFonts w:cstheme="minorHAnsi"/>
-          <w:color w:val="000000" w:themeColor="text1"/>
-          <w:sz w:val="20"/>
-          <w:szCs w:val="20"/>
-          <w14:shadow w14:blurRad="38100" w14:dist="19050" w14:dir="2700000" w14:sx="100000" w14:sy="100000" w14:kx="0" w14:ky="0" w14:algn="tl">
-            <w14:schemeClr w14:val="dk1">
-              <w14:alpha w14:val="60000"/>
-            </w14:schemeClr>
-          </w14:shadow>
-          <w14:textOutline w14:w="0" w14:cap="flat" w14:cmpd="sng" w14:algn="ctr">
-            <w14:noFill/>
-            <w14:prstDash w14:val="solid"/>
-            <w14:round/>
-          </w14:textOutline>
-        </w:rPr>
-        <w:t>{</w:t>
+        <w:t xml:space="preserve"> Senha: {</w:t>
       </w:r>
       <w:r>
         <w:rPr>
@@ -515,26 +496,7 @@
             <w14:round/>
           </w14:textOutline>
         </w:rPr>
-        <w:t>{</w:t>
-      </w:r>
-      <w:r>
-        <w:rPr>
-          <w:rFonts w:cstheme="minorHAnsi"/>
-          <w:color w:val="000000" w:themeColor="text1"/>
-          <w:sz w:val="20"/>
-          <w:szCs w:val="20"/>
-          <w14:shadow w14:blurRad="38100" w14:dist="19050" w14:dir="2700000" w14:sx="100000" w14:sy="100000" w14:kx="0" w14:ky="0" w14:algn="tl">
-            <w14:schemeClr w14:val="dk1">
-              <w14:alpha w14:val="60000"/>
-            </w14:schemeClr>
-          </w14:shadow>
-          <w14:textOutline w14:w="0" w14:cap="flat" w14:cmpd="sng" w14:algn="ctr">
-            <w14:noFill/>
-            <w14:prstDash w14:val="solid"/>
-            <w14:round/>
-          </w14:textOutline>
-        </w:rPr>
-        <w:t>DOMAIN</w:t>
+        <w:t>{DOMAIN</w:t>
       </w:r>
       <w:r>
         <w:rPr>
@@ -650,26 +612,7 @@
             <w14:round/>
           </w14:textOutline>
         </w:rPr>
-        <w:t>EMAIL</w:t>
-      </w:r>
-      <w:r>
-        <w:rPr>
-          <w:rFonts w:cstheme="minorHAnsi"/>
-          <w:color w:val="000000" w:themeColor="text1"/>
-          <w:sz w:val="20"/>
-          <w:szCs w:val="20"/>
-          <w14:shadow w14:blurRad="38100" w14:dist="19050" w14:dir="2700000" w14:sx="100000" w14:sy="100000" w14:kx="0" w14:ky="0" w14:algn="tl">
-            <w14:schemeClr w14:val="dk1">
-              <w14:alpha w14:val="60000"/>
-            </w14:schemeClr>
-          </w14:shadow>
-          <w14:textOutline w14:w="0" w14:cap="flat" w14:cmpd="sng" w14:algn="ctr">
-            <w14:noFill/>
-            <w14:prstDash w14:val="solid"/>
-            <w14:round/>
-          </w14:textOutline>
-        </w:rPr>
-        <w:t>}</w:t>
+        <w:t>EMAIL}</w:t>
       </w:r>
     </w:p>
     <w:p>
@@ -1068,7 +1011,46 @@
             <w14:round/>
           </w14:textOutline>
         </w:rPr>
-        <w:t xml:space="preserve">Login: </w:t>
+        <w:t>Login: {</w:t>
+      </w:r>
+      <w:r>
+        <w:rPr>
+          <w:rFonts w:cstheme="minorHAnsi"/>
+          <w:color w:val="000000" w:themeColor="text1"/>
+          <w:sz w:val="20"/>
+          <w:szCs w:val="20"/>
+          <w14:shadow w14:blurRad="38100" w14:dist="19050" w14:dir="2700000" w14:sx="100000" w14:sy="100000" w14:kx="0" w14:ky="0" w14:algn="tl">
+            <w14:schemeClr w14:val="dk1">
+              <w14:alpha w14:val="60000"/>
+            </w14:schemeClr>
+          </w14:shadow>
+          <w14:textOutline w14:w="0" w14:cap="flat" w14:cmpd="sng" w14:algn="ctr">
+            <w14:noFill/>
+            <w14:prstDash w14:val="solid"/>
+            <w14:round/>
+          </w14:textOutline>
+        </w:rPr>
+        <w:t>LOGIN_</w:t>
+      </w:r>
+      <w:proofErr w:type="gramStart"/>
+      <w:r>
+        <w:rPr>
+          <w:rFonts w:cstheme="minorHAnsi"/>
+          <w:color w:val="000000" w:themeColor="text1"/>
+          <w:sz w:val="20"/>
+          <w:szCs w:val="20"/>
+          <w14:shadow w14:blurRad="38100" w14:dist="19050" w14:dir="2700000" w14:sx="100000" w14:sy="100000" w14:kx="0" w14:ky="0" w14:algn="tl">
+            <w14:schemeClr w14:val="dk1">
+              <w14:alpha w14:val="60000"/>
+            </w14:schemeClr>
+          </w14:shadow>
+          <w14:textOutline w14:w="0" w14:cap="flat" w14:cmpd="sng" w14:algn="ctr">
+            <w14:noFill/>
+            <w14:prstDash w14:val="solid"/>
+            <w14:round/>
+          </w14:textOutline>
+        </w:rPr>
+        <w:t>TEAMS</w:t>
       </w:r>
       <w:r>
         <w:rPr>
@@ -1088,46 +1070,7 @@
             <w14:round/>
           </w14:textOutline>
         </w:rPr>
-        <w:t>{</w:t>
-      </w:r>
-      <w:r>
-        <w:rPr>
-          <w:rFonts w:cstheme="minorHAnsi"/>
-          <w:color w:val="000000" w:themeColor="text1"/>
-          <w:sz w:val="20"/>
-          <w:szCs w:val="20"/>
-          <w14:shadow w14:blurRad="38100" w14:dist="19050" w14:dir="2700000" w14:sx="100000" w14:sy="100000" w14:kx="0" w14:ky="0" w14:algn="tl">
-            <w14:schemeClr w14:val="dk1">
-              <w14:alpha w14:val="60000"/>
-            </w14:schemeClr>
-          </w14:shadow>
-          <w14:textOutline w14:w="0" w14:cap="flat" w14:cmpd="sng" w14:algn="ctr">
-            <w14:noFill/>
-            <w14:prstDash w14:val="solid"/>
-            <w14:round/>
-          </w14:textOutline>
-        </w:rPr>
-        <w:t>LOGIN_</w:t>
-      </w:r>
-      <w:proofErr w:type="gramStart"/>
-      <w:r>
-        <w:rPr>
-          <w:rFonts w:cstheme="minorHAnsi"/>
-          <w:color w:val="000000" w:themeColor="text1"/>
-          <w:sz w:val="20"/>
-          <w:szCs w:val="20"/>
-          <w14:shadow w14:blurRad="38100" w14:dist="19050" w14:dir="2700000" w14:sx="100000" w14:sy="100000" w14:kx="0" w14:ky="0" w14:algn="tl">
-            <w14:schemeClr w14:val="dk1">
-              <w14:alpha w14:val="60000"/>
-            </w14:schemeClr>
-          </w14:shadow>
-          <w14:textOutline w14:w="0" w14:cap="flat" w14:cmpd="sng" w14:algn="ctr">
-            <w14:noFill/>
-            <w14:prstDash w14:val="solid"/>
-            <w14:round/>
-          </w14:textOutline>
-        </w:rPr>
-        <w:t>VBD</w:t>
+        <w:t>}</w:t>
       </w:r>
       <w:r>
         <w:rPr>
@@ -1147,8 +1090,9 @@
             <w14:round/>
           </w14:textOutline>
         </w:rPr>
-        <w:t>}</w:t>
-      </w:r>
+        <w:t>@</w:t>
+      </w:r>
+      <w:proofErr w:type="gramEnd"/>
       <w:r>
         <w:rPr>
           <w:rFonts w:cstheme="minorHAnsi"/>
@@ -1167,9 +1111,8 @@
             <w14:round/>
           </w14:textOutline>
         </w:rPr>
-        <w:t>@</w:t>
-      </w:r>
-      <w:proofErr w:type="gramEnd"/>
+        <w:t>{DOMAIN</w:t>
+      </w:r>
       <w:r>
         <w:rPr>
           <w:rFonts w:cstheme="minorHAnsi"/>
@@ -1188,7 +1131,7 @@
             <w14:round/>
           </w14:textOutline>
         </w:rPr>
-        <w:t>{</w:t>
+        <w:t>_</w:t>
       </w:r>
       <w:r>
         <w:rPr>
@@ -1208,67 +1151,7 @@
             <w14:round/>
           </w14:textOutline>
         </w:rPr>
-        <w:t>DOMAIN</w:t>
-      </w:r>
-      <w:r>
-        <w:rPr>
-          <w:rFonts w:cstheme="minorHAnsi"/>
-          <w:color w:val="000000" w:themeColor="text1"/>
-          <w:sz w:val="20"/>
-          <w:szCs w:val="20"/>
-          <w:lang w:val="es-419"/>
-          <w14:shadow w14:blurRad="38100" w14:dist="19050" w14:dir="2700000" w14:sx="100000" w14:sy="100000" w14:kx="0" w14:ky="0" w14:algn="tl">
-            <w14:schemeClr w14:val="dk1">
-              <w14:alpha w14:val="60000"/>
-            </w14:schemeClr>
-          </w14:shadow>
-          <w14:textOutline w14:w="0" w14:cap="flat" w14:cmpd="sng" w14:algn="ctr">
-            <w14:noFill/>
-            <w14:prstDash w14:val="solid"/>
-            <w14:round/>
-          </w14:textOutline>
-        </w:rPr>
-        <w:t>_</w:t>
-      </w:r>
-      <w:r>
-        <w:rPr>
-          <w:rFonts w:cstheme="minorHAnsi"/>
-          <w:color w:val="000000" w:themeColor="text1"/>
-          <w:sz w:val="20"/>
-          <w:szCs w:val="20"/>
-          <w:lang w:val="es-419"/>
-          <w14:shadow w14:blurRad="38100" w14:dist="19050" w14:dir="2700000" w14:sx="100000" w14:sy="100000" w14:kx="0" w14:ky="0" w14:algn="tl">
-            <w14:schemeClr w14:val="dk1">
-              <w14:alpha w14:val="60000"/>
-            </w14:schemeClr>
-          </w14:shadow>
-          <w14:textOutline w14:w="0" w14:cap="flat" w14:cmpd="sng" w14:algn="ctr">
-            <w14:noFill/>
-            <w14:prstDash w14:val="solid"/>
-            <w14:round/>
-          </w14:textOutline>
-        </w:rPr>
-        <w:t>ORG</w:t>
-      </w:r>
-      <w:r>
-        <w:rPr>
-          <w:rFonts w:cstheme="minorHAnsi"/>
-          <w:color w:val="000000" w:themeColor="text1"/>
-          <w:sz w:val="20"/>
-          <w:szCs w:val="20"/>
-          <w:lang w:val="es-419"/>
-          <w14:shadow w14:blurRad="38100" w14:dist="19050" w14:dir="2700000" w14:sx="100000" w14:sy="100000" w14:kx="0" w14:ky="0" w14:algn="tl">
-            <w14:schemeClr w14:val="dk1">
-              <w14:alpha w14:val="60000"/>
-            </w14:schemeClr>
-          </w14:shadow>
-          <w14:textOutline w14:w="0" w14:cap="flat" w14:cmpd="sng" w14:algn="ctr">
-            <w14:noFill/>
-            <w14:prstDash w14:val="solid"/>
-            <w14:round/>
-          </w14:textOutline>
-        </w:rPr>
-        <w:t>}</w:t>
+        <w:t>ORG}</w:t>
       </w:r>
     </w:p>
     <w:p>
@@ -1308,26 +1191,7 @@
             <w14:round/>
           </w14:textOutline>
         </w:rPr>
-        <w:t xml:space="preserve">Senha: </w:t>
-      </w:r>
-      <w:r>
-        <w:rPr>
-          <w:rFonts w:cstheme="minorHAnsi"/>
-          <w:color w:val="000000" w:themeColor="text1"/>
-          <w:sz w:val="20"/>
-          <w:szCs w:val="20"/>
-          <w14:shadow w14:blurRad="38100" w14:dist="19050" w14:dir="2700000" w14:sx="100000" w14:sy="100000" w14:kx="0" w14:ky="0" w14:algn="tl">
-            <w14:schemeClr w14:val="dk1">
-              <w14:alpha w14:val="60000"/>
-            </w14:schemeClr>
-          </w14:shadow>
-          <w14:textOutline w14:w="0" w14:cap="flat" w14:cmpd="sng" w14:algn="ctr">
-            <w14:noFill/>
-            <w14:prstDash w14:val="solid"/>
-            <w14:round/>
-          </w14:textOutline>
-        </w:rPr>
-        <w:t>{</w:t>
+        <w:t>Senha: {</w:t>
       </w:r>
       <w:r>
         <w:rPr>
@@ -1365,26 +1229,7 @@
             <w14:round/>
           </w14:textOutline>
         </w:rPr>
-        <w:t>TEAMS</w:t>
-      </w:r>
-      <w:r>
-        <w:rPr>
-          <w:rFonts w:cstheme="minorHAnsi"/>
-          <w:color w:val="000000" w:themeColor="text1"/>
-          <w:sz w:val="20"/>
-          <w:szCs w:val="20"/>
-          <w14:shadow w14:blurRad="38100" w14:dist="19050" w14:dir="2700000" w14:sx="100000" w14:sy="100000" w14:kx="0" w14:ky="0" w14:algn="tl">
-            <w14:schemeClr w14:val="dk1">
-              <w14:alpha w14:val="60000"/>
-            </w14:schemeClr>
-          </w14:shadow>
-          <w14:textOutline w14:w="0" w14:cap="flat" w14:cmpd="sng" w14:algn="ctr">
-            <w14:noFill/>
-            <w14:prstDash w14:val="solid"/>
-            <w14:round/>
-          </w14:textOutline>
-        </w:rPr>
-        <w:t>}</w:t>
+        <w:t>TEAMS}</w:t>
       </w:r>
     </w:p>
     <w:p>
@@ -1659,26 +1504,7 @@
             <w14:round/>
           </w14:textOutline>
         </w:rPr>
-        <w:t>VBD</w:t>
-      </w:r>
-      <w:r>
-        <w:rPr>
-          <w:rFonts w:cstheme="minorHAnsi"/>
-          <w:color w:val="000000" w:themeColor="text1"/>
-          <w:sz w:val="20"/>
-          <w:szCs w:val="20"/>
-          <w14:shadow w14:blurRad="38100" w14:dist="19050" w14:dir="2700000" w14:sx="100000" w14:sy="100000" w14:kx="0" w14:ky="0" w14:algn="tl">
-            <w14:schemeClr w14:val="dk1">
-              <w14:alpha w14:val="60000"/>
-            </w14:schemeClr>
-          </w14:shadow>
-          <w14:textOutline w14:w="0" w14:cap="flat" w14:cmpd="sng" w14:algn="ctr">
-            <w14:noFill/>
-            <w14:prstDash w14:val="solid"/>
-            <w14:round/>
-          </w14:textOutline>
-        </w:rPr>
-        <w:t>}</w:t>
+        <w:t>VBD}</w:t>
       </w:r>
     </w:p>
     <w:p>
@@ -1779,26 +1605,7 @@
           </w14:textOutline>
         </w:rPr>
         <w:tab/>
-        <w:t xml:space="preserve">Login: </w:t>
-      </w:r>
-      <w:r>
-        <w:rPr>
-          <w:rFonts w:cstheme="minorHAnsi"/>
-          <w:color w:val="000000" w:themeColor="text1"/>
-          <w:sz w:val="20"/>
-          <w:szCs w:val="20"/>
-          <w14:shadow w14:blurRad="38100" w14:dist="19050" w14:dir="2700000" w14:sx="100000" w14:sy="100000" w14:kx="0" w14:ky="0" w14:algn="tl">
-            <w14:schemeClr w14:val="dk1">
-              <w14:alpha w14:val="60000"/>
-            </w14:schemeClr>
-          </w14:shadow>
-          <w14:textOutline w14:w="0" w14:cap="flat" w14:cmpd="sng" w14:algn="ctr">
-            <w14:noFill/>
-            <w14:prstDash w14:val="solid"/>
-            <w14:round/>
-          </w14:textOutline>
-        </w:rPr>
-        <w:t>{</w:t>
+        <w:t>Login: {</w:t>
       </w:r>
       <w:r>
         <w:rPr>
@@ -1952,404 +1759,27 @@
             <w14:round/>
           </w14:textOutline>
         </w:rPr>
-        <w:t>FORTICLIENT</w:t>
-      </w:r>
-      <w:r>
-        <w:rPr>
-          <w:rFonts w:cstheme="minorHAnsi"/>
-          <w:color w:val="000000" w:themeColor="text1"/>
-          <w:sz w:val="20"/>
-          <w:szCs w:val="20"/>
-          <w14:shadow w14:blurRad="38100" w14:dist="19050" w14:dir="2700000" w14:sx="100000" w14:sy="100000" w14:kx="0" w14:ky="0" w14:algn="tl">
-            <w14:schemeClr w14:val="dk1">
-              <w14:alpha w14:val="60000"/>
-            </w14:schemeClr>
-          </w14:shadow>
-          <w14:textOutline w14:w="0" w14:cap="flat" w14:cmpd="sng" w14:algn="ctr">
-            <w14:noFill/>
-            <w14:prstDash w14:val="solid"/>
-            <w14:round/>
-          </w14:textOutline>
-        </w:rPr>
-        <w:t>}</w:t>
-      </w:r>
-    </w:p>
-    <w:p>
-      <w:pPr>
-        <w:rPr>
-          <w:rFonts w:ascii="Arboria-Bold" w:hAnsi="Arboria-Bold"/>
-          <w:color w:val="000000" w:themeColor="text1"/>
-          <w:sz w:val="24"/>
-          <w:szCs w:val="24"/>
-          <w14:shadow w14:blurRad="38100" w14:dist="19050" w14:dir="2700000" w14:sx="100000" w14:sy="100000" w14:kx="0" w14:ky="0" w14:algn="tl">
-            <w14:schemeClr w14:val="dk1">
-              <w14:alpha w14:val="60000"/>
-            </w14:schemeClr>
-          </w14:shadow>
-          <w14:textOutline w14:w="0" w14:cap="flat" w14:cmpd="sng" w14:algn="ctr">
-            <w14:noFill/>
-            <w14:prstDash w14:val="solid"/>
-            <w14:round/>
-          </w14:textOutline>
-        </w:rPr>
-      </w:pPr>
-    </w:p>
-    <w:p>
-      <w:pPr>
-        <w:rPr>
-          <w:rFonts w:cstheme="minorHAnsi"/>
-          <w:color w:val="000000" w:themeColor="text1"/>
-          <w:sz w:val="20"/>
-          <w:szCs w:val="20"/>
-          <w14:shadow w14:blurRad="38100" w14:dist="19050" w14:dir="2700000" w14:sx="100000" w14:sy="100000" w14:kx="0" w14:ky="0" w14:algn="tl">
-            <w14:schemeClr w14:val="dk1">
-              <w14:alpha w14:val="60000"/>
-            </w14:schemeClr>
-          </w14:shadow>
-          <w14:textOutline w14:w="0" w14:cap="flat" w14:cmpd="sng" w14:algn="ctr">
-            <w14:noFill/>
-            <w14:prstDash w14:val="solid"/>
-            <w14:round/>
-          </w14:textOutline>
-        </w:rPr>
-      </w:pPr>
-      <w:r>
-        <w:rPr>
-          <w:noProof/>
-        </w:rPr>
-        <w:drawing>
-          <wp:anchor distT="0" distB="0" distL="0" distR="0" simplePos="0" relativeHeight="2" behindDoc="0" locked="0" layoutInCell="0" allowOverlap="1" wp14:anchorId="226BD634" wp14:editId="1E054B94">
-            <wp:simplePos x="0" y="0"/>
-            <wp:positionH relativeFrom="margin">
-              <wp:align>center</wp:align>
-            </wp:positionH>
-            <wp:positionV relativeFrom="paragraph">
-              <wp:posOffset>7855585</wp:posOffset>
-            </wp:positionV>
-            <wp:extent cx="6637655" cy="1807210"/>
-            <wp:effectExtent l="0" t="0" r="0" b="0"/>
-            <wp:wrapNone/>
-            <wp:docPr id="2" name="Imagem 7"/>
-            <wp:cNvGraphicFramePr>
-              <a:graphicFrameLocks xmlns:a="http://schemas.openxmlformats.org/drawingml/2006/main" noChangeAspect="1"/>
-            </wp:cNvGraphicFramePr>
-            <a:graphic xmlns:a="http://schemas.openxmlformats.org/drawingml/2006/main">
-              <a:graphicData uri="http://schemas.openxmlformats.org/drawingml/2006/picture">
-                <pic:pic xmlns:pic="http://schemas.openxmlformats.org/drawingml/2006/picture">
-                  <pic:nvPicPr>
-                    <pic:cNvPr id="2" name="Imagem 7"/>
-                    <pic:cNvPicPr>
-                      <a:picLocks noChangeAspect="1" noChangeArrowheads="1"/>
-                    </pic:cNvPicPr>
-                  </pic:nvPicPr>
-                  <pic:blipFill>
-                    <a:blip r:embed="rId6"/>
-                    <a:srcRect l="11868" b="7113"/>
-                    <a:stretch>
-                      <a:fillRect/>
-                    </a:stretch>
-                  </pic:blipFill>
-                  <pic:spPr bwMode="auto">
-                    <a:xfrm>
-                      <a:off x="0" y="0"/>
-                      <a:ext cx="6637655" cy="1807210"/>
-                    </a:xfrm>
-                    <a:prstGeom prst="rect">
-                      <a:avLst/>
-                    </a:prstGeom>
-                    <a:noFill/>
-                  </pic:spPr>
-                </pic:pic>
-              </a:graphicData>
-            </a:graphic>
-          </wp:anchor>
-        </w:drawing>
-      </w:r>
-      <w:r>
-        <w:rPr>
-          <w:noProof/>
-        </w:rPr>
-        <w:drawing>
-          <wp:anchor distT="0" distB="0" distL="0" distR="0" simplePos="0" relativeHeight="3" behindDoc="0" locked="0" layoutInCell="0" allowOverlap="1" wp14:anchorId="4C313991" wp14:editId="177A507C">
-            <wp:simplePos x="0" y="0"/>
-            <wp:positionH relativeFrom="margin">
-              <wp:align>center</wp:align>
-            </wp:positionH>
-            <wp:positionV relativeFrom="paragraph">
-              <wp:posOffset>7855585</wp:posOffset>
-            </wp:positionV>
-            <wp:extent cx="6637655" cy="1807210"/>
-            <wp:effectExtent l="0" t="0" r="0" b="0"/>
-            <wp:wrapNone/>
-            <wp:docPr id="3" name="Imagem 4"/>
-            <wp:cNvGraphicFramePr>
-              <a:graphicFrameLocks xmlns:a="http://schemas.openxmlformats.org/drawingml/2006/main" noChangeAspect="1"/>
-            </wp:cNvGraphicFramePr>
-            <a:graphic xmlns:a="http://schemas.openxmlformats.org/drawingml/2006/main">
-              <a:graphicData uri="http://schemas.openxmlformats.org/drawingml/2006/picture">
-                <pic:pic xmlns:pic="http://schemas.openxmlformats.org/drawingml/2006/picture">
-                  <pic:nvPicPr>
-                    <pic:cNvPr id="3" name="Imagem 4"/>
-                    <pic:cNvPicPr>
-                      <a:picLocks noChangeAspect="1" noChangeArrowheads="1"/>
-                    </pic:cNvPicPr>
-                  </pic:nvPicPr>
-                  <pic:blipFill>
-                    <a:blip r:embed="rId6"/>
-                    <a:srcRect l="11868" b="7113"/>
-                    <a:stretch>
-                      <a:fillRect/>
-                    </a:stretch>
-                  </pic:blipFill>
-                  <pic:spPr bwMode="auto">
-                    <a:xfrm>
-                      <a:off x="0" y="0"/>
-                      <a:ext cx="6637655" cy="1807210"/>
-                    </a:xfrm>
-                    <a:prstGeom prst="rect">
-                      <a:avLst/>
-                    </a:prstGeom>
-                    <a:noFill/>
-                  </pic:spPr>
-                </pic:pic>
-              </a:graphicData>
-            </a:graphic>
-          </wp:anchor>
-        </w:drawing>
-      </w:r>
-      <w:proofErr w:type="gramStart"/>
-      <w:r>
-        <w:rPr>
-          <w:rFonts w:cstheme="minorHAnsi"/>
-          <w:b/>
-          <w:color w:val="000000" w:themeColor="text1"/>
-          <w:sz w:val="20"/>
-          <w:szCs w:val="20"/>
-          <w:lang w:val="en-US"/>
-          <w14:shadow w14:blurRad="38100" w14:dist="19050" w14:dir="2700000" w14:sx="100000" w14:sy="100000" w14:kx="0" w14:ky="0" w14:algn="tl">
-            <w14:schemeClr w14:val="dk1">
-              <w14:alpha w14:val="60000"/>
-            </w14:schemeClr>
-          </w14:shadow>
-          <w14:textOutline w14:w="0" w14:cap="flat" w14:cmpd="sng" w14:algn="ctr">
-            <w14:noFill/>
-            <w14:prstDash w14:val="solid"/>
-            <w14:round/>
-          </w14:textOutline>
-        </w:rPr>
-        <w:t>Processo:</w:t>
-      </w:r>
-      <w:r>
-        <w:t xml:space="preserve"> </w:t>
-      </w:r>
-      <w:r>
-        <w:t>#</w:t>
-      </w:r>
-      <w:r>
-        <w:rPr>
-          <w:rFonts w:cstheme="minorHAnsi"/>
-          <w:color w:val="000000" w:themeColor="text1"/>
-          <w:sz w:val="20"/>
-          <w:szCs w:val="20"/>
-          <w14:shadow w14:blurRad="38100" w14:dist="19050" w14:dir="2700000" w14:sx="100000" w14:sy="100000" w14:kx="0" w14:ky="0" w14:algn="tl">
-            <w14:schemeClr w14:val="dk1">
-              <w14:alpha w14:val="60000"/>
-            </w14:schemeClr>
-          </w14:shadow>
-          <w14:textOutline w14:w="0" w14:cap="flat" w14:cmpd="sng" w14:algn="ctr">
-            <w14:noFill/>
-            <w14:prstDash w14:val="solid"/>
-            <w14:round/>
-          </w14:textOutline>
-        </w:rPr>
-        <w:t>{</w:t>
-      </w:r>
-      <w:proofErr w:type="gramEnd"/>
-      <w:r>
-        <w:rPr>
-          <w:rFonts w:cstheme="minorHAnsi"/>
-          <w:color w:val="000000" w:themeColor="text1"/>
-          <w:sz w:val="20"/>
-          <w:szCs w:val="20"/>
-          <w14:shadow w14:blurRad="38100" w14:dist="19050" w14:dir="2700000" w14:sx="100000" w14:sy="100000" w14:kx="0" w14:ky="0" w14:algn="tl">
-            <w14:schemeClr w14:val="dk1">
-              <w14:alpha w14:val="60000"/>
-            </w14:schemeClr>
-          </w14:shadow>
-          <w14:textOutline w14:w="0" w14:cap="flat" w14:cmpd="sng" w14:algn="ctr">
-            <w14:noFill/>
-            <w14:prstDash w14:val="solid"/>
-            <w14:round/>
-          </w14:textOutline>
-        </w:rPr>
-        <w:t>PROCESS_NUMBER}</w:t>
-      </w:r>
-    </w:p>
-    <w:p>
-      <w:pPr>
-        <w:rPr>
-          <w:rFonts w:cstheme="minorHAnsi"/>
-          <w:b/>
-          <w:color w:val="000000" w:themeColor="text1"/>
-          <w:sz w:val="20"/>
-          <w:szCs w:val="20"/>
-          <w:lang w:val="en-US"/>
-          <w14:shadow w14:blurRad="38100" w14:dist="19050" w14:dir="2700000" w14:sx="100000" w14:sy="100000" w14:kx="0" w14:ky="0" w14:algn="tl">
-            <w14:schemeClr w14:val="dk1">
-              <w14:alpha w14:val="60000"/>
-            </w14:schemeClr>
-          </w14:shadow>
-          <w14:textOutline w14:w="0" w14:cap="flat" w14:cmpd="sng" w14:algn="ctr">
-            <w14:noFill/>
-            <w14:prstDash w14:val="solid"/>
-            <w14:round/>
-          </w14:textOutline>
-        </w:rPr>
-      </w:pPr>
-    </w:p>
-    <w:p>
-      <w:pPr>
-        <w:rPr>
-          <w:rFonts w:cstheme="minorHAnsi"/>
-          <w:color w:val="000000" w:themeColor="text1"/>
-          <w:sz w:val="20"/>
-          <w:szCs w:val="20"/>
-          <w:lang w:val="en-US"/>
-          <w14:shadow w14:blurRad="38100" w14:dist="19050" w14:dir="2700000" w14:sx="100000" w14:sy="100000" w14:kx="0" w14:ky="0" w14:algn="tl">
-            <w14:schemeClr w14:val="dk1">
-              <w14:alpha w14:val="60000"/>
-            </w14:schemeClr>
-          </w14:shadow>
-          <w14:textOutline w14:w="0" w14:cap="flat" w14:cmpd="sng" w14:algn="ctr">
-            <w14:noFill/>
-            <w14:prstDash w14:val="solid"/>
-            <w14:round/>
-          </w14:textOutline>
-        </w:rPr>
-      </w:pPr>
-      <w:r>
-        <w:rPr>
-          <w:rFonts w:cstheme="minorHAnsi"/>
-          <w:b/>
-          <w:color w:val="000000" w:themeColor="text1"/>
-          <w:sz w:val="20"/>
-          <w:szCs w:val="20"/>
-          <w:lang w:val="en-US"/>
-          <w14:shadow w14:blurRad="38100" w14:dist="19050" w14:dir="2700000" w14:sx="100000" w14:sy="100000" w14:kx="0" w14:ky="0" w14:algn="tl">
-            <w14:schemeClr w14:val="dk1">
-              <w14:alpha w14:val="60000"/>
-            </w14:schemeClr>
-          </w14:shadow>
-          <w14:textOutline w14:w="0" w14:cap="flat" w14:cmpd="sng" w14:algn="ctr">
-            <w14:noFill/>
-            <w14:prstDash w14:val="solid"/>
-            <w14:round/>
-          </w14:textOutline>
-        </w:rPr>
-        <w:t>Patrimônio da Máquina:</w:t>
-      </w:r>
-      <w:r>
-        <w:rPr>
-          <w:rFonts w:cstheme="minorHAnsi"/>
-          <w:bCs/>
-          <w:color w:val="000000" w:themeColor="text1"/>
-          <w:sz w:val="20"/>
-          <w:szCs w:val="20"/>
-          <w:lang w:val="en-US"/>
-          <w14:shadow w14:blurRad="38100" w14:dist="19050" w14:dir="2700000" w14:sx="100000" w14:sy="100000" w14:kx="0" w14:ky="0" w14:algn="tl">
-            <w14:schemeClr w14:val="dk1">
-              <w14:alpha w14:val="60000"/>
-            </w14:schemeClr>
-          </w14:shadow>
-          <w14:textOutline w14:w="0" w14:cap="flat" w14:cmpd="sng" w14:algn="ctr">
-            <w14:noFill/>
-            <w14:prstDash w14:val="solid"/>
-            <w14:round/>
-          </w14:textOutline>
-        </w:rPr>
-        <w:t xml:space="preserve"> </w:t>
-      </w:r>
-      <w:r>
-        <w:rPr>
-          <w:rFonts w:cstheme="minorHAnsi"/>
-          <w:color w:val="000000" w:themeColor="text1"/>
-          <w:sz w:val="20"/>
-          <w:szCs w:val="20"/>
-          <w:lang w:val="en-US"/>
-          <w14:shadow w14:blurRad="38100" w14:dist="19050" w14:dir="2700000" w14:sx="100000" w14:sy="100000" w14:kx="0" w14:ky="0" w14:algn="tl">
-            <w14:schemeClr w14:val="dk1">
-              <w14:alpha w14:val="60000"/>
-            </w14:schemeClr>
-          </w14:shadow>
-          <w14:textOutline w14:w="0" w14:cap="flat" w14:cmpd="sng" w14:algn="ctr">
-            <w14:noFill/>
-            <w14:prstDash w14:val="solid"/>
-            <w14:round/>
-          </w14:textOutline>
-        </w:rPr>
-        <w:t>{</w:t>
-      </w:r>
-      <w:r>
-        <w:rPr>
-          <w:rFonts w:cstheme="minorHAnsi"/>
-          <w:color w:val="000000" w:themeColor="text1"/>
-          <w:sz w:val="20"/>
-          <w:szCs w:val="20"/>
-          <w:lang w:val="en-US"/>
-          <w14:shadow w14:blurRad="38100" w14:dist="19050" w14:dir="2700000" w14:sx="100000" w14:sy="100000" w14:kx="0" w14:ky="0" w14:algn="tl">
-            <w14:schemeClr w14:val="dk1">
-              <w14:alpha w14:val="60000"/>
-            </w14:schemeClr>
-          </w14:shadow>
-          <w14:textOutline w14:w="0" w14:cap="flat" w14:cmpd="sng" w14:algn="ctr">
-            <w14:noFill/>
-            <w14:prstDash w14:val="solid"/>
-            <w14:round/>
-          </w14:textOutline>
-        </w:rPr>
-        <w:t>ASSET</w:t>
-      </w:r>
-      <w:r>
-        <w:rPr>
-          <w:rFonts w:cstheme="minorHAnsi"/>
-          <w:color w:val="000000" w:themeColor="text1"/>
-          <w:sz w:val="20"/>
-          <w:szCs w:val="20"/>
-          <w:lang w:val="en-US"/>
-          <w14:shadow w14:blurRad="38100" w14:dist="19050" w14:dir="2700000" w14:sx="100000" w14:sy="100000" w14:kx="0" w14:ky="0" w14:algn="tl">
-            <w14:schemeClr w14:val="dk1">
-              <w14:alpha w14:val="60000"/>
-            </w14:schemeClr>
-          </w14:shadow>
-          <w14:textOutline w14:w="0" w14:cap="flat" w14:cmpd="sng" w14:algn="ctr">
-            <w14:noFill/>
-            <w14:prstDash w14:val="solid"/>
-            <w14:round/>
-          </w14:textOutline>
-        </w:rPr>
-        <w:t>}</w:t>
-      </w:r>
-    </w:p>
-    <w:p>
-      <w:pPr>
-        <w:rPr>
-          <w:rFonts w:cstheme="minorHAnsi"/>
-          <w:color w:val="000000" w:themeColor="text1"/>
-          <w:sz w:val="20"/>
-          <w:szCs w:val="20"/>
-          <w:lang w:val="en-US"/>
-          <w14:shadow w14:blurRad="38100" w14:dist="19050" w14:dir="2700000" w14:sx="100000" w14:sy="100000" w14:kx="0" w14:ky="0" w14:algn="tl">
-            <w14:schemeClr w14:val="dk1">
-              <w14:alpha w14:val="60000"/>
-            </w14:schemeClr>
-          </w14:shadow>
-          <w14:textOutline w14:w="0" w14:cap="flat" w14:cmpd="sng" w14:algn="ctr">
-            <w14:noFill/>
-            <w14:prstDash w14:val="solid"/>
-            <w14:round/>
-          </w14:textOutline>
-        </w:rPr>
-      </w:pPr>
+        <w:t>FORT</w:t>
+      </w:r>
+      <w:r>
+        <w:rPr>
+          <w:rFonts w:cstheme="minorHAnsi"/>
+          <w:color w:val="000000" w:themeColor="text1"/>
+          <w:sz w:val="20"/>
+          <w:szCs w:val="20"/>
+          <w14:shadow w14:blurRad="38100" w14:dist="19050" w14:dir="2700000" w14:sx="100000" w14:sy="100000" w14:kx="0" w14:ky="0" w14:algn="tl">
+            <w14:schemeClr w14:val="dk1">
+              <w14:alpha w14:val="60000"/>
+            </w14:schemeClr>
+          </w14:shadow>
+          <w14:textOutline w14:w="0" w14:cap="flat" w14:cmpd="sng" w14:algn="ctr">
+            <w14:noFill/>
+            <w14:prstDash w14:val="solid"/>
+            <w14:round/>
+          </w14:textOutline>
+        </w:rPr>
+        <w:t>CLIENT}</w:t>
+      </w:r>
     </w:p>
     <w:sectPr>
       <w:pgSz w:w="11906" w:h="16838"/>
@@ -2768,6 +2198,7 @@
   <w:style w:type="character" w:default="1" w:styleId="Fontepargpadro">
     <w:name w:val="Default Paragraph Font"/>
     <w:uiPriority w:val="1"/>
+    <w:semiHidden/>
     <w:unhideWhenUsed/>
   </w:style>
   <w:style w:type="table" w:default="1" w:styleId="Tabelanormal">

</xml_diff>